<commit_message>
Orders by Status report
</commit_message>
<xml_diff>
--- a/src/main/resources/com/company/crm/reports/client-profile/client-profile.docx
+++ b/src/main/resources/com/company/crm/reports/client-profile/client-profile.docx
@@ -63,30 +63,7 @@
           <w:szCs w:val="18"/>
           <w14:ligatures w14:val="none"/>
         </w:rPr>
-        <w:t>${</w:t>
-      </w:r>
-      <w:proofErr w:type="spellStart"/>
-      <w:r>
-        <w:rPr>
-          <w:rFonts w:ascii="Arial" w:eastAsia="Times New Roman" w:hAnsi="Arial" w:cs="Arial"/>
-          <w:color w:val="666666"/>
-          <w:kern w:val="0"/>
-          <w:sz w:val="18"/>
-          <w:szCs w:val="18"/>
-          <w14:ligatures w14:val="none"/>
-        </w:rPr>
-        <w:t>Root</w:t>
-      </w:r>
-      <w:r>
-        <w:rPr>
-          <w:rFonts w:ascii="Arial" w:eastAsia="Times New Roman" w:hAnsi="Arial" w:cs="Arial"/>
-          <w:color w:val="666666"/>
-          <w:kern w:val="0"/>
-          <w:sz w:val="18"/>
-          <w:szCs w:val="18"/>
-          <w14:ligatures w14:val="none"/>
-        </w:rPr>
-        <w:t>.</w:t>
+        <w:t>${Root.</w:t>
       </w:r>
       <w:r>
         <w:rPr>
@@ -99,7 +76,6 @@
         </w:rPr>
         <w:t>generatedAt</w:t>
       </w:r>
-      <w:proofErr w:type="spellEnd"/>
       <w:r>
         <w:rPr>
           <w:rFonts w:ascii="Arial" w:eastAsia="Times New Roman" w:hAnsi="Arial" w:cs="Arial"/>

</xml_diff>